<commit_message>
Adicionado a rota de signup e testado pelo insomnia
</commit_message>
<xml_diff>
--- a/Projeto Portal 2.docx
+++ b/Projeto Portal 2.docx
@@ -1,6 +1,6 @@
 
 <file path=word/document.xml><?xml version="1.0" encoding="utf-8"?>
-<w:document xmlns:wpc="http://schemas.microsoft.com/office/word/2010/wordprocessingCanvas" xmlns:cx="http://schemas.microsoft.com/office/drawing/2014/chartex" xmlns:cx1="http://schemas.microsoft.com/office/drawing/2015/9/8/chartex" xmlns:cx2="http://schemas.microsoft.com/office/drawing/2015/10/21/chartex" xmlns:cx3="http://schemas.microsoft.com/office/drawing/2016/5/9/chartex" xmlns:cx4="http://schemas.microsoft.com/office/drawing/2016/5/10/chartex" xmlns:cx5="http://schemas.microsoft.com/office/drawing/2016/5/11/chartex" xmlns:cx6="http://schemas.microsoft.com/office/drawing/2016/5/12/chartex" xmlns:cx7="http://schemas.microsoft.com/office/drawing/2016/5/13/chartex" xmlns:cx8="http://schemas.microsoft.com/office/drawing/2016/5/14/chartex" xmlns:mc="http://schemas.openxmlformats.org/markup-compatibility/2006" xmlns:aink="http://schemas.microsoft.com/office/drawing/2016/ink" xmlns:am3d="http://schemas.microsoft.com/office/drawing/2017/model3d" xmlns:o="urn:schemas-microsoft-com:office:office" xmlns:oel="http://schemas.microsoft.com/office/2019/extlst" xmlns:r="http://schemas.openxmlformats.org/officeDocument/2006/relationships" xmlns:m="http://schemas.openxmlformats.org/officeDocument/2006/math" xmlns:v="urn:schemas-microsoft-com:vml" xmlns:wp14="http://schemas.microsoft.com/office/word/2010/wordprocessingDrawing" xmlns:wp="http://schemas.openxmlformats.org/drawingml/2006/wordprocessingDrawing" xmlns:w10="urn:schemas-microsoft-com:office:word" xmlns:w="http://schemas.openxmlformats.org/wordprocessingml/2006/main" xmlns:w14="http://schemas.microsoft.com/office/word/2010/wordml" xmlns:w15="http://schemas.microsoft.com/office/word/2012/wordml" xmlns:w16cex="http://schemas.microsoft.com/office/word/2018/wordml/cex" xmlns:w16cid="http://schemas.microsoft.com/office/word/2016/wordml/cid" xmlns:w16="http://schemas.microsoft.com/office/word/2018/wordml" xmlns:w16sdtdh="http://schemas.microsoft.com/office/word/2020/wordml/sdtdatahash" xmlns:w16se="http://schemas.microsoft.com/office/word/2015/wordml/symex" xmlns:wpg="http://schemas.microsoft.com/office/word/2010/wordprocessingGroup" xmlns:wpi="http://schemas.microsoft.com/office/word/2010/wordprocessingInk" xmlns:wne="http://schemas.microsoft.com/office/word/2006/wordml" xmlns:wps="http://schemas.microsoft.com/office/word/2010/wordprocessingShape" mc:Ignorable="w14 w15 w16se w16cid w16 w16cex w16sdtdh wp14">
+<w:document xmlns:wpc="http://schemas.microsoft.com/office/word/2010/wordprocessingCanvas" xmlns:cx="http://schemas.microsoft.com/office/drawing/2014/chartex" xmlns:cx1="http://schemas.microsoft.com/office/drawing/2015/9/8/chartex" xmlns:cx2="http://schemas.microsoft.com/office/drawing/2015/10/21/chartex" xmlns:cx3="http://schemas.microsoft.com/office/drawing/2016/5/9/chartex" xmlns:cx4="http://schemas.microsoft.com/office/drawing/2016/5/10/chartex" xmlns:cx5="http://schemas.microsoft.com/office/drawing/2016/5/11/chartex" xmlns:cx6="http://schemas.microsoft.com/office/drawing/2016/5/12/chartex" xmlns:cx7="http://schemas.microsoft.com/office/drawing/2016/5/13/chartex" xmlns:cx8="http://schemas.microsoft.com/office/drawing/2016/5/14/chartex" xmlns:mc="http://schemas.openxmlformats.org/markup-compatibility/2006" xmlns:aink="http://schemas.microsoft.com/office/drawing/2016/ink" xmlns:am3d="http://schemas.microsoft.com/office/drawing/2017/model3d" xmlns:o="urn:schemas-microsoft-com:office:office" xmlns:oel="http://schemas.microsoft.com/office/2019/extlst" xmlns:r="http://schemas.openxmlformats.org/officeDocument/2006/relationships" xmlns:m="http://schemas.openxmlformats.org/officeDocument/2006/math" xmlns:v="urn:schemas-microsoft-com:vml" xmlns:wp14="http://schemas.microsoft.com/office/word/2010/wordprocessingDrawing" xmlns:wp="http://schemas.openxmlformats.org/drawingml/2006/wordprocessingDrawing" xmlns:w10="urn:schemas-microsoft-com:office:word" xmlns:w="http://schemas.openxmlformats.org/wordprocessingml/2006/main" xmlns:w14="http://schemas.microsoft.com/office/word/2010/wordml" xmlns:w15="http://schemas.microsoft.com/office/word/2012/wordml" xmlns:w16cex="http://schemas.microsoft.com/office/word/2018/wordml/cex" xmlns:w16cid="http://schemas.microsoft.com/office/word/2016/wordml/cid" xmlns:w16="http://schemas.microsoft.com/office/word/2018/wordml" xmlns:w16du="http://schemas.microsoft.com/office/word/2023/wordml/word16du" xmlns:w16sdtdh="http://schemas.microsoft.com/office/word/2020/wordml/sdtdatahash" xmlns:w16se="http://schemas.microsoft.com/office/word/2015/wordml/symex" xmlns:wpg="http://schemas.microsoft.com/office/word/2010/wordprocessingGroup" xmlns:wpi="http://schemas.microsoft.com/office/word/2010/wordprocessingInk" xmlns:wne="http://schemas.microsoft.com/office/word/2006/wordml" xmlns:wps="http://schemas.microsoft.com/office/word/2010/wordprocessingShape" mc:Ignorable="w14 w15 w16se w16cid w16 w16cex w16sdtdh w16du wp14">
   <w:body>
     <w:p>
       <w:r>
@@ -18,6 +18,19 @@
         <w:t>A ideia do projeto é criar uma ferramenta de uso universal aqui na empresa que contem múltiplas ferramentas para todos os funcionários.</w:t>
       </w:r>
     </w:p>
+    <w:p/>
+    <w:p>
+      <w:r>
+        <w:t>Dia 1</w:t>
+      </w:r>
+    </w:p>
+    <w:p>
+      <w:r>
+        <w:t>Comecei criando o projeto base, separando em front e back, utilizando react e node, respectivamente. Fiz a conexão com o banco IbExpert (firebird) e comecei a desenvolver a estrutura. Por enquanto as pastas ficaram assim: (arquitetura do projeto).</w:t>
+      </w:r>
+    </w:p>
+    <w:p/>
+    <w:p/>
     <w:p/>
     <w:p/>
     <w:p/>
@@ -89,52 +102,22 @@
                       <wps:txbx>
                         <w:txbxContent>
                           <w:p>
-                            <w:proofErr w:type="spellStart"/>
                             <w:r>
                               <w:rPr>
                                 <w:rStyle w:val="Forte"/>
                               </w:rPr>
-                              <w:t>src</w:t>
-                            </w:r>
-                            <w:proofErr w:type="spellEnd"/>
-                            <w:r>
-                              <w:rPr>
-                                <w:rStyle w:val="Forte"/>
-                              </w:rPr>
-                              <w:t>/</w:t>
+                              <w:t>src/</w:t>
                             </w:r>
                             <w:r>
                               <w:t xml:space="preserve"> = diretório principal do código-fonte</w:t>
                             </w:r>
                           </w:p>
                           <w:p>
-                            <w:proofErr w:type="spellStart"/>
                             <w:r>
                               <w:rPr>
                                 <w:rStyle w:val="Forte"/>
                               </w:rPr>
-                              <w:t>src</w:t>
-                            </w:r>
-                            <w:proofErr w:type="spellEnd"/>
-                            <w:r>
-                              <w:rPr>
-                                <w:rStyle w:val="Forte"/>
-                              </w:rPr>
-                              <w:t>/</w:t>
-                            </w:r>
-                            <w:proofErr w:type="spellStart"/>
-                            <w:r>
-                              <w:rPr>
-                                <w:rStyle w:val="Forte"/>
-                              </w:rPr>
-                              <w:t>config</w:t>
-                            </w:r>
-                            <w:proofErr w:type="spellEnd"/>
-                            <w:r>
-                              <w:rPr>
-                                <w:rStyle w:val="Forte"/>
-                              </w:rPr>
-                              <w:t>/</w:t>
+                              <w:t>src/config/</w:t>
                             </w:r>
                             <w:r>
                               <w:t xml:space="preserve"> = configurações gerais do projeto</w:t>
@@ -145,52 +128,22 @@
                             <w:pPr>
                               <w:pStyle w:val="NormalWeb"/>
                             </w:pPr>
-                            <w:proofErr w:type="spellStart"/>
                             <w:r>
                               <w:rPr>
                                 <w:rStyle w:val="Forte"/>
                               </w:rPr>
-                              <w:t>src</w:t>
-                            </w:r>
-                            <w:proofErr w:type="spellEnd"/>
-                            <w:r>
-                              <w:rPr>
-                                <w:rStyle w:val="Forte"/>
-                              </w:rPr>
-                              <w:t>/</w:t>
-                            </w:r>
-                            <w:proofErr w:type="spellStart"/>
-                            <w:r>
-                              <w:rPr>
-                                <w:rStyle w:val="Forte"/>
-                              </w:rPr>
-                              <w:t>controllers</w:t>
-                            </w:r>
-                            <w:proofErr w:type="spellEnd"/>
-                            <w:r>
-                              <w:rPr>
-                                <w:rStyle w:val="Forte"/>
-                              </w:rPr>
-                              <w:t>/</w:t>
+                              <w:t>src/controllers/</w:t>
                             </w:r>
                             <w:r>
                               <w:t xml:space="preserve"> = controladores que recebem requisições HTTP e enviam respostas</w:t>
                             </w:r>
                           </w:p>
                           <w:p>
-                            <w:proofErr w:type="spellStart"/>
                             <w:r>
                               <w:rPr>
                                 <w:rStyle w:val="Forte"/>
                               </w:rPr>
-                              <w:t>src</w:t>
-                            </w:r>
-                            <w:proofErr w:type="spellEnd"/>
-                            <w:r>
-                              <w:rPr>
-                                <w:rStyle w:val="Forte"/>
-                              </w:rPr>
-                              <w:t>/models/</w:t>
+                              <w:t>src/models/</w:t>
                             </w:r>
                             <w:r>
                               <w:t xml:space="preserve"> = modelos de dados utilizados pela aplicação</w:t>
@@ -201,66 +154,22 @@
                             <w:pPr>
                               <w:pStyle w:val="NormalWeb"/>
                             </w:pPr>
-                            <w:proofErr w:type="spellStart"/>
                             <w:r>
                               <w:rPr>
                                 <w:rStyle w:val="Forte"/>
                               </w:rPr>
-                              <w:t>src</w:t>
-                            </w:r>
-                            <w:proofErr w:type="spellEnd"/>
-                            <w:r>
-                              <w:rPr>
-                                <w:rStyle w:val="Forte"/>
-                              </w:rPr>
-                              <w:t>/</w:t>
-                            </w:r>
-                            <w:proofErr w:type="spellStart"/>
-                            <w:r>
-                              <w:rPr>
-                                <w:rStyle w:val="Forte"/>
-                              </w:rPr>
-                              <w:t>repositories</w:t>
-                            </w:r>
-                            <w:proofErr w:type="spellEnd"/>
-                            <w:r>
-                              <w:rPr>
-                                <w:rStyle w:val="Forte"/>
-                              </w:rPr>
-                              <w:t>/</w:t>
+                              <w:t>src/repositories/</w:t>
                             </w:r>
                             <w:r>
                               <w:t xml:space="preserve"> = repositórios que interagem com o banco de dados</w:t>
                             </w:r>
                           </w:p>
                           <w:p>
-                            <w:proofErr w:type="spellStart"/>
                             <w:r>
                               <w:rPr>
                                 <w:rStyle w:val="Forte"/>
                               </w:rPr>
-                              <w:t>src</w:t>
-                            </w:r>
-                            <w:proofErr w:type="spellEnd"/>
-                            <w:r>
-                              <w:rPr>
-                                <w:rStyle w:val="Forte"/>
-                              </w:rPr>
-                              <w:t>/</w:t>
-                            </w:r>
-                            <w:proofErr w:type="spellStart"/>
-                            <w:r>
-                              <w:rPr>
-                                <w:rStyle w:val="Forte"/>
-                              </w:rPr>
-                              <w:t>routes</w:t>
-                            </w:r>
-                            <w:proofErr w:type="spellEnd"/>
-                            <w:r>
-                              <w:rPr>
-                                <w:rStyle w:val="Forte"/>
-                              </w:rPr>
-                              <w:t>/</w:t>
+                              <w:t>src/routes/</w:t>
                             </w:r>
                             <w:r>
                               <w:t xml:space="preserve"> = definição das rotas da aplicação</w:t>
@@ -268,33 +177,11 @@
                           </w:p>
                           <w:p/>
                           <w:p>
-                            <w:proofErr w:type="spellStart"/>
                             <w:r>
                               <w:rPr>
                                 <w:rStyle w:val="Forte"/>
                               </w:rPr>
-                              <w:t>src</w:t>
-                            </w:r>
-                            <w:proofErr w:type="spellEnd"/>
-                            <w:r>
-                              <w:rPr>
-                                <w:rStyle w:val="Forte"/>
-                              </w:rPr>
-                              <w:t>/</w:t>
-                            </w:r>
-                            <w:proofErr w:type="spellStart"/>
-                            <w:r>
-                              <w:rPr>
-                                <w:rStyle w:val="Forte"/>
-                              </w:rPr>
-                              <w:t>services</w:t>
-                            </w:r>
-                            <w:proofErr w:type="spellEnd"/>
-                            <w:r>
-                              <w:rPr>
-                                <w:rStyle w:val="Forte"/>
-                              </w:rPr>
-                              <w:t>/</w:t>
+                              <w:t>src/services/</w:t>
                             </w:r>
                             <w:r>
                               <w:t xml:space="preserve"> = serviços que contêm a lógica de negócios</w:t>
@@ -305,19 +192,11 @@
                             <w:pPr>
                               <w:pStyle w:val="NormalWeb"/>
                             </w:pPr>
-                            <w:proofErr w:type="spellStart"/>
                             <w:r>
                               <w:rPr>
                                 <w:rStyle w:val="Forte"/>
                               </w:rPr>
-                              <w:t>src</w:t>
-                            </w:r>
-                            <w:proofErr w:type="spellEnd"/>
-                            <w:r>
-                              <w:rPr>
-                                <w:rStyle w:val="Forte"/>
-                              </w:rPr>
-                              <w:t>/server.js</w:t>
+                              <w:t>src/server.js</w:t>
                             </w:r>
                             <w:r>
                               <w:t xml:space="preserve"> = arquivo principal que inicializa o servidor</w:t>
@@ -329,16 +208,8 @@
                               <w:rPr>
                                 <w:rStyle w:val="Forte"/>
                               </w:rPr>
-                              <w:t>.</w:t>
+                              <w:t>.env</w:t>
                             </w:r>
-                            <w:proofErr w:type="spellStart"/>
-                            <w:r>
-                              <w:rPr>
-                                <w:rStyle w:val="Forte"/>
-                              </w:rPr>
-                              <w:t>env</w:t>
-                            </w:r>
-                            <w:proofErr w:type="spellEnd"/>
                             <w:proofErr w:type="gramEnd"/>
                             <w:r>
                               <w:t xml:space="preserve"> = arquivo de variáveis de ambiente</w:t>
@@ -348,7 +219,6 @@
                             <w:pPr>
                               <w:pStyle w:val="NormalWeb"/>
                             </w:pPr>
-                            <w:proofErr w:type="spellStart"/>
                             <w:proofErr w:type="gramStart"/>
                             <w:r>
                               <w:rPr>
@@ -356,26 +226,17 @@
                               </w:rPr>
                               <w:t>package.json</w:t>
                             </w:r>
-                            <w:proofErr w:type="spellEnd"/>
                             <w:proofErr w:type="gramEnd"/>
                             <w:r>
                               <w:t xml:space="preserve"> = arquivo de configuração do NPM</w:t>
                             </w:r>
                           </w:p>
                           <w:p>
-                            <w:proofErr w:type="spellStart"/>
                             <w:r>
                               <w:rPr>
                                 <w:rStyle w:val="Forte"/>
                               </w:rPr>
-                              <w:t>node_modules</w:t>
-                            </w:r>
-                            <w:proofErr w:type="spellEnd"/>
-                            <w:r>
-                              <w:rPr>
-                                <w:rStyle w:val="Forte"/>
-                              </w:rPr>
-                              <w:t>/</w:t>
+                              <w:t>node_modules/</w:t>
                             </w:r>
                             <w:r>
                               <w:t xml:space="preserve"> = pasta onde as dependências instaladas pelo NPM estão armazenadas</w:t>
@@ -405,56 +266,26 @@
                 <v:stroke joinstyle="miter"/>
                 <v:path gradientshapeok="t" o:connecttype="rect"/>
               </v:shapetype>
-              <v:shape id="Caixa de Texto 2" o:spid="_x0000_s1026" type="#_x0000_t202" style="position:absolute;margin-left:273.1pt;margin-top:.7pt;width:185.9pt;height:110.6pt;z-index:251659264;visibility:visible;mso-wrap-style:square;mso-width-percent:400;mso-height-percent:200;mso-wrap-distance-left:9pt;mso-wrap-distance-top:3.6pt;mso-wrap-distance-right:9pt;mso-wrap-distance-bottom:3.6pt;mso-position-horizontal:absolute;mso-position-horizontal-relative:margin;mso-position-vertical:absolute;mso-position-vertical-relative:text;mso-width-percent:400;mso-height-percent:200;mso-width-relative:margin;mso-height-relative:margin;v-text-anchor:top" o:gfxdata="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">
+              <v:shape id="Caixa de Texto 2" o:spid="_x0000_s1026" type="#_x0000_t202" style="position:absolute;margin-left:273.1pt;margin-top:.7pt;width:185.9pt;height:110.6pt;z-index:251659264;visibility:visible;mso-wrap-style:square;mso-width-percent:400;mso-height-percent:200;mso-wrap-distance-left:9pt;mso-wrap-distance-top:3.6pt;mso-wrap-distance-right:9pt;mso-wrap-distance-bottom:3.6pt;mso-position-horizontal:absolute;mso-position-horizontal-relative:margin;mso-position-vertical:absolute;mso-position-vertical-relative:text;mso-width-percent:400;mso-height-percent:200;mso-width-relative:margin;mso-height-relative:margin;v-text-anchor:top" o:gfxdata="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">
                 <v:textbox style="mso-fit-shape-to-text:t">
                   <w:txbxContent>
                     <w:p>
-                      <w:proofErr w:type="spellStart"/>
                       <w:r>
                         <w:rPr>
                           <w:rStyle w:val="Forte"/>
                         </w:rPr>
-                        <w:t>src</w:t>
-                      </w:r>
-                      <w:proofErr w:type="spellEnd"/>
-                      <w:r>
-                        <w:rPr>
-                          <w:rStyle w:val="Forte"/>
-                        </w:rPr>
-                        <w:t>/</w:t>
+                        <w:t>src/</w:t>
                       </w:r>
                       <w:r>
                         <w:t xml:space="preserve"> = diretório principal do código-fonte</w:t>
                       </w:r>
                     </w:p>
                     <w:p>
-                      <w:proofErr w:type="spellStart"/>
                       <w:r>
                         <w:rPr>
                           <w:rStyle w:val="Forte"/>
                         </w:rPr>
-                        <w:t>src</w:t>
-                      </w:r>
-                      <w:proofErr w:type="spellEnd"/>
-                      <w:r>
-                        <w:rPr>
-                          <w:rStyle w:val="Forte"/>
-                        </w:rPr>
-                        <w:t>/</w:t>
-                      </w:r>
-                      <w:proofErr w:type="spellStart"/>
-                      <w:r>
-                        <w:rPr>
-                          <w:rStyle w:val="Forte"/>
-                        </w:rPr>
-                        <w:t>config</w:t>
-                      </w:r>
-                      <w:proofErr w:type="spellEnd"/>
-                      <w:r>
-                        <w:rPr>
-                          <w:rStyle w:val="Forte"/>
-                        </w:rPr>
-                        <w:t>/</w:t>
+                        <w:t>src/config/</w:t>
                       </w:r>
                       <w:r>
                         <w:t xml:space="preserve"> = configurações gerais do projeto</w:t>
@@ -465,52 +296,22 @@
                       <w:pPr>
                         <w:pStyle w:val="NormalWeb"/>
                       </w:pPr>
-                      <w:proofErr w:type="spellStart"/>
                       <w:r>
                         <w:rPr>
                           <w:rStyle w:val="Forte"/>
                         </w:rPr>
-                        <w:t>src</w:t>
-                      </w:r>
-                      <w:proofErr w:type="spellEnd"/>
-                      <w:r>
-                        <w:rPr>
-                          <w:rStyle w:val="Forte"/>
-                        </w:rPr>
-                        <w:t>/</w:t>
-                      </w:r>
-                      <w:proofErr w:type="spellStart"/>
-                      <w:r>
-                        <w:rPr>
-                          <w:rStyle w:val="Forte"/>
-                        </w:rPr>
-                        <w:t>controllers</w:t>
-                      </w:r>
-                      <w:proofErr w:type="spellEnd"/>
-                      <w:r>
-                        <w:rPr>
-                          <w:rStyle w:val="Forte"/>
-                        </w:rPr>
-                        <w:t>/</w:t>
+                        <w:t>src/controllers/</w:t>
                       </w:r>
                       <w:r>
                         <w:t xml:space="preserve"> = controladores que recebem requisições HTTP e enviam respostas</w:t>
                       </w:r>
                     </w:p>
                     <w:p>
-                      <w:proofErr w:type="spellStart"/>
                       <w:r>
                         <w:rPr>
                           <w:rStyle w:val="Forte"/>
                         </w:rPr>
-                        <w:t>src</w:t>
-                      </w:r>
-                      <w:proofErr w:type="spellEnd"/>
-                      <w:r>
-                        <w:rPr>
-                          <w:rStyle w:val="Forte"/>
-                        </w:rPr>
-                        <w:t>/models/</w:t>
+                        <w:t>src/models/</w:t>
                       </w:r>
                       <w:r>
                         <w:t xml:space="preserve"> = modelos de dados utilizados pela aplicação</w:t>
@@ -521,66 +322,22 @@
                       <w:pPr>
                         <w:pStyle w:val="NormalWeb"/>
                       </w:pPr>
-                      <w:proofErr w:type="spellStart"/>
                       <w:r>
                         <w:rPr>
                           <w:rStyle w:val="Forte"/>
                         </w:rPr>
-                        <w:t>src</w:t>
-                      </w:r>
-                      <w:proofErr w:type="spellEnd"/>
-                      <w:r>
-                        <w:rPr>
-                          <w:rStyle w:val="Forte"/>
-                        </w:rPr>
-                        <w:t>/</w:t>
-                      </w:r>
-                      <w:proofErr w:type="spellStart"/>
-                      <w:r>
-                        <w:rPr>
-                          <w:rStyle w:val="Forte"/>
-                        </w:rPr>
-                        <w:t>repositories</w:t>
-                      </w:r>
-                      <w:proofErr w:type="spellEnd"/>
-                      <w:r>
-                        <w:rPr>
-                          <w:rStyle w:val="Forte"/>
-                        </w:rPr>
-                        <w:t>/</w:t>
+                        <w:t>src/repositories/</w:t>
                       </w:r>
                       <w:r>
                         <w:t xml:space="preserve"> = repositórios que interagem com o banco de dados</w:t>
                       </w:r>
                     </w:p>
                     <w:p>
-                      <w:proofErr w:type="spellStart"/>
                       <w:r>
                         <w:rPr>
                           <w:rStyle w:val="Forte"/>
                         </w:rPr>
-                        <w:t>src</w:t>
-                      </w:r>
-                      <w:proofErr w:type="spellEnd"/>
-                      <w:r>
-                        <w:rPr>
-                          <w:rStyle w:val="Forte"/>
-                        </w:rPr>
-                        <w:t>/</w:t>
-                      </w:r>
-                      <w:proofErr w:type="spellStart"/>
-                      <w:r>
-                        <w:rPr>
-                          <w:rStyle w:val="Forte"/>
-                        </w:rPr>
-                        <w:t>routes</w:t>
-                      </w:r>
-                      <w:proofErr w:type="spellEnd"/>
-                      <w:r>
-                        <w:rPr>
-                          <w:rStyle w:val="Forte"/>
-                        </w:rPr>
-                        <w:t>/</w:t>
+                        <w:t>src/routes/</w:t>
                       </w:r>
                       <w:r>
                         <w:t xml:space="preserve"> = definição das rotas da aplicação</w:t>
@@ -588,33 +345,11 @@
                     </w:p>
                     <w:p/>
                     <w:p>
-                      <w:proofErr w:type="spellStart"/>
                       <w:r>
                         <w:rPr>
                           <w:rStyle w:val="Forte"/>
                         </w:rPr>
-                        <w:t>src</w:t>
-                      </w:r>
-                      <w:proofErr w:type="spellEnd"/>
-                      <w:r>
-                        <w:rPr>
-                          <w:rStyle w:val="Forte"/>
-                        </w:rPr>
-                        <w:t>/</w:t>
-                      </w:r>
-                      <w:proofErr w:type="spellStart"/>
-                      <w:r>
-                        <w:rPr>
-                          <w:rStyle w:val="Forte"/>
-                        </w:rPr>
-                        <w:t>services</w:t>
-                      </w:r>
-                      <w:proofErr w:type="spellEnd"/>
-                      <w:r>
-                        <w:rPr>
-                          <w:rStyle w:val="Forte"/>
-                        </w:rPr>
-                        <w:t>/</w:t>
+                        <w:t>src/services/</w:t>
                       </w:r>
                       <w:r>
                         <w:t xml:space="preserve"> = serviços que contêm a lógica de negócios</w:t>
@@ -625,19 +360,11 @@
                       <w:pPr>
                         <w:pStyle w:val="NormalWeb"/>
                       </w:pPr>
-                      <w:proofErr w:type="spellStart"/>
                       <w:r>
                         <w:rPr>
                           <w:rStyle w:val="Forte"/>
                         </w:rPr>
-                        <w:t>src</w:t>
-                      </w:r>
-                      <w:proofErr w:type="spellEnd"/>
-                      <w:r>
-                        <w:rPr>
-                          <w:rStyle w:val="Forte"/>
-                        </w:rPr>
-                        <w:t>/server.js</w:t>
+                        <w:t>src/server.js</w:t>
                       </w:r>
                       <w:r>
                         <w:t xml:space="preserve"> = arquivo principal que inicializa o servidor</w:t>
@@ -649,16 +376,8 @@
                         <w:rPr>
                           <w:rStyle w:val="Forte"/>
                         </w:rPr>
-                        <w:t>.</w:t>
+                        <w:t>.env</w:t>
                       </w:r>
-                      <w:proofErr w:type="spellStart"/>
-                      <w:r>
-                        <w:rPr>
-                          <w:rStyle w:val="Forte"/>
-                        </w:rPr>
-                        <w:t>env</w:t>
-                      </w:r>
-                      <w:proofErr w:type="spellEnd"/>
                       <w:proofErr w:type="gramEnd"/>
                       <w:r>
                         <w:t xml:space="preserve"> = arquivo de variáveis de ambiente</w:t>
@@ -668,7 +387,6 @@
                       <w:pPr>
                         <w:pStyle w:val="NormalWeb"/>
                       </w:pPr>
-                      <w:proofErr w:type="spellStart"/>
                       <w:proofErr w:type="gramStart"/>
                       <w:r>
                         <w:rPr>
@@ -676,26 +394,17 @@
                         </w:rPr>
                         <w:t>package.json</w:t>
                       </w:r>
-                      <w:proofErr w:type="spellEnd"/>
                       <w:proofErr w:type="gramEnd"/>
                       <w:r>
                         <w:t xml:space="preserve"> = arquivo de configuração do NPM</w:t>
                       </w:r>
                     </w:p>
                     <w:p>
-                      <w:proofErr w:type="spellStart"/>
                       <w:r>
                         <w:rPr>
                           <w:rStyle w:val="Forte"/>
                         </w:rPr>
-                        <w:t>node_modules</w:t>
-                      </w:r>
-                      <w:proofErr w:type="spellEnd"/>
-                      <w:r>
-                        <w:rPr>
-                          <w:rStyle w:val="Forte"/>
-                        </w:rPr>
-                        <w:t>/</w:t>
+                        <w:t>node_modules/</w:t>
                       </w:r>
                       <w:r>
                         <w:t xml:space="preserve"> = pasta onde as dependências instaladas pelo NPM estão armazenadas</w:t>
@@ -711,10 +420,7 @@
         </mc:AlternateContent>
       </w:r>
       <w:r>
-        <w:t>projeto_portal2</w:t>
-      </w:r>
-      <w:r>
-        <w:t>/</w:t>
+        <w:t>projeto_portal2/</w:t>
       </w:r>
     </w:p>
     <w:p>
@@ -736,15 +442,7 @@
         <w:t>──</w:t>
       </w:r>
       <w:r>
-        <w:t xml:space="preserve"> </w:t>
-      </w:r>
-      <w:proofErr w:type="spellStart"/>
-      <w:r>
-        <w:t>src</w:t>
-      </w:r>
-      <w:proofErr w:type="spellEnd"/>
-      <w:r>
-        <w:t>/</w:t>
+        <w:t xml:space="preserve"> src/</w:t>
       </w:r>
     </w:p>
     <w:p>
@@ -764,15 +462,7 @@
         <w:t>──</w:t>
       </w:r>
       <w:r>
-        <w:t xml:space="preserve"> </w:t>
-      </w:r>
-      <w:proofErr w:type="spellStart"/>
-      <w:r>
-        <w:t>config</w:t>
-      </w:r>
-      <w:proofErr w:type="spellEnd"/>
-      <w:r>
-        <w:t>/</w:t>
+        <w:t xml:space="preserve"> config/</w:t>
       </w:r>
     </w:p>
     <w:p>
@@ -792,15 +482,7 @@
         <w:t>──</w:t>
       </w:r>
       <w:r>
-        <w:t xml:space="preserve"> </w:t>
-      </w:r>
-      <w:proofErr w:type="spellStart"/>
-      <w:r>
-        <w:t>controllers</w:t>
-      </w:r>
-      <w:proofErr w:type="spellEnd"/>
-      <w:r>
-        <w:t>/</w:t>
+        <w:t xml:space="preserve"> controllers/</w:t>
       </w:r>
     </w:p>
     <w:p>
@@ -845,15 +527,7 @@
         <w:t>──</w:t>
       </w:r>
       <w:r>
-        <w:t xml:space="preserve"> </w:t>
-      </w:r>
-      <w:proofErr w:type="spellStart"/>
-      <w:r>
-        <w:t>repositories</w:t>
-      </w:r>
-      <w:proofErr w:type="spellEnd"/>
-      <w:r>
-        <w:t>/</w:t>
+        <w:t xml:space="preserve"> repositories/</w:t>
       </w:r>
     </w:p>
     <w:p>
@@ -873,15 +547,7 @@
         <w:t>──</w:t>
       </w:r>
       <w:r>
-        <w:t xml:space="preserve"> </w:t>
-      </w:r>
-      <w:proofErr w:type="spellStart"/>
-      <w:r>
-        <w:t>routes</w:t>
-      </w:r>
-      <w:proofErr w:type="spellEnd"/>
-      <w:r>
-        <w:t>/</w:t>
+        <w:t xml:space="preserve"> routes/</w:t>
       </w:r>
     </w:p>
     <w:p>
@@ -906,15 +572,7 @@
         <w:t>──</w:t>
       </w:r>
       <w:r>
-        <w:t xml:space="preserve"> </w:t>
-      </w:r>
-      <w:proofErr w:type="spellStart"/>
-      <w:r>
-        <w:t>services</w:t>
-      </w:r>
-      <w:proofErr w:type="spellEnd"/>
-      <w:r>
-        <w:t>/</w:t>
+        <w:t xml:space="preserve"> services/</w:t>
       </w:r>
     </w:p>
     <w:p>
@@ -953,13 +611,8 @@
         <w:t>─</w:t>
       </w:r>
       <w:r>
-        <w:t xml:space="preserve"> .</w:t>
-      </w:r>
-      <w:proofErr w:type="spellStart"/>
-      <w:r>
-        <w:t>env</w:t>
-      </w:r>
-      <w:proofErr w:type="spellEnd"/>
+        <w:t xml:space="preserve"> .env</w:t>
+      </w:r>
       <w:proofErr w:type="gramEnd"/>
     </w:p>
     <w:p>
@@ -978,25 +631,15 @@
       <w:r>
         <w:t xml:space="preserve"> </w:t>
       </w:r>
-      <w:proofErr w:type="spellStart"/>
       <w:proofErr w:type="gramStart"/>
       <w:r>
         <w:t>package.json</w:t>
       </w:r>
-      <w:proofErr w:type="spellEnd"/>
       <w:proofErr w:type="gramEnd"/>
     </w:p>
     <w:p>
       <w:r>
-        <w:t xml:space="preserve">└── </w:t>
-      </w:r>
-      <w:proofErr w:type="spellStart"/>
-      <w:r>
-        <w:t>node_modules</w:t>
-      </w:r>
-      <w:proofErr w:type="spellEnd"/>
-      <w:r>
-        <w:t>/</w:t>
+        <w:t>└── node_modules/</w:t>
       </w:r>
     </w:p>
     <w:p/>
@@ -1008,7 +651,1070 @@
         <w:br w:type="page"/>
       </w:r>
     </w:p>
+    <w:p>
+      <w:r>
+        <w:lastRenderedPageBreak/>
+        <w:t>Dia 2</w:t>
+      </w:r>
+    </w:p>
     <w:p/>
+    <w:p>
+      <w:r>
+        <w:t xml:space="preserve">Comecei hoje vendo o </w:t>
+      </w:r>
+      <w:proofErr w:type="gramStart"/>
+      <w:r>
+        <w:t>vídeo :</w:t>
+      </w:r>
+      <w:proofErr w:type="gramEnd"/>
+      <w:r>
+        <w:t xml:space="preserve"> </w:t>
+      </w:r>
+      <w:r>
+        <w:t>Build and Deploy a Complete Chat App with MERN Stack | JWT, Socket.io, MongoDB | Beginner Friendly</w:t>
+      </w:r>
+      <w:r>
+        <w:t>.</w:t>
+      </w:r>
+    </w:p>
+    <w:p>
+      <w:r>
+        <w:t xml:space="preserve">A ideia é seguir esse vídeo para entender como faz a arquitetura de um projeto. </w:t>
+      </w:r>
+    </w:p>
+    <w:p/>
+    <w:p>
+      <w:pPr>
+        <w:shd w:val="clear" w:color="auto" w:fill="1E1E1E"/>
+        <w:spacing w:after="0" w:line="285" w:lineRule="atLeast"/>
+        <w:rPr>
+          <w:rFonts w:ascii="Consolas" w:eastAsia="Times New Roman" w:hAnsi="Consolas" w:cs="Times New Roman"/>
+          <w:color w:val="D4D4D4"/>
+          <w:kern w:val="0"/>
+          <w:sz w:val="21"/>
+          <w:szCs w:val="21"/>
+          <w:lang w:eastAsia="pt-BR"/>
+          <w14:ligatures w14:val="none"/>
+        </w:rPr>
+      </w:pPr>
+      <w:r>
+        <w:rPr>
+          <w:rFonts w:ascii="Consolas" w:eastAsia="Times New Roman" w:hAnsi="Consolas" w:cs="Times New Roman"/>
+          <w:color w:val="6A9955"/>
+          <w:kern w:val="0"/>
+          <w:sz w:val="21"/>
+          <w:szCs w:val="21"/>
+          <w:lang w:eastAsia="pt-BR"/>
+          <w14:ligatures w14:val="none"/>
+        </w:rPr>
+        <w:t>//aqui seria como eu fizesse no server.js, mas isso fica feio, então vamos usar os middlewares para isso</w:t>
+      </w:r>
+    </w:p>
+    <w:p>
+      <w:pPr>
+        <w:shd w:val="clear" w:color="auto" w:fill="1E1E1E"/>
+        <w:spacing w:after="0" w:line="285" w:lineRule="atLeast"/>
+        <w:rPr>
+          <w:rFonts w:ascii="Consolas" w:eastAsia="Times New Roman" w:hAnsi="Consolas" w:cs="Times New Roman"/>
+          <w:color w:val="D4D4D4"/>
+          <w:kern w:val="0"/>
+          <w:sz w:val="21"/>
+          <w:szCs w:val="21"/>
+          <w:lang w:eastAsia="pt-BR"/>
+          <w14:ligatures w14:val="none"/>
+        </w:rPr>
+      </w:pPr>
+    </w:p>
+    <w:p>
+      <w:pPr>
+        <w:shd w:val="clear" w:color="auto" w:fill="1E1E1E"/>
+        <w:spacing w:after="0" w:line="285" w:lineRule="atLeast"/>
+        <w:rPr>
+          <w:rFonts w:ascii="Consolas" w:eastAsia="Times New Roman" w:hAnsi="Consolas" w:cs="Times New Roman"/>
+          <w:color w:val="D4D4D4"/>
+          <w:kern w:val="0"/>
+          <w:sz w:val="21"/>
+          <w:szCs w:val="21"/>
+          <w:lang w:eastAsia="pt-BR"/>
+          <w14:ligatures w14:val="none"/>
+        </w:rPr>
+      </w:pPr>
+      <w:proofErr w:type="gramStart"/>
+      <w:r>
+        <w:rPr>
+          <w:rFonts w:ascii="Consolas" w:eastAsia="Times New Roman" w:hAnsi="Consolas" w:cs="Times New Roman"/>
+          <w:color w:val="4FC1FF"/>
+          <w:kern w:val="0"/>
+          <w:sz w:val="21"/>
+          <w:szCs w:val="21"/>
+          <w:lang w:eastAsia="pt-BR"/>
+          <w14:ligatures w14:val="none"/>
+        </w:rPr>
+        <w:t>app</w:t>
+      </w:r>
+      <w:r>
+        <w:rPr>
+          <w:rFonts w:ascii="Consolas" w:eastAsia="Times New Roman" w:hAnsi="Consolas" w:cs="Times New Roman"/>
+          <w:color w:val="D4D4D4"/>
+          <w:kern w:val="0"/>
+          <w:sz w:val="21"/>
+          <w:szCs w:val="21"/>
+          <w:lang w:eastAsia="pt-BR"/>
+          <w14:ligatures w14:val="none"/>
+        </w:rPr>
+        <w:t>.</w:t>
+      </w:r>
+      <w:r>
+        <w:rPr>
+          <w:rFonts w:ascii="Consolas" w:eastAsia="Times New Roman" w:hAnsi="Consolas" w:cs="Times New Roman"/>
+          <w:color w:val="DCDCAA"/>
+          <w:kern w:val="0"/>
+          <w:sz w:val="21"/>
+          <w:szCs w:val="21"/>
+          <w:lang w:eastAsia="pt-BR"/>
+          <w14:ligatures w14:val="none"/>
+        </w:rPr>
+        <w:t>get</w:t>
+      </w:r>
+      <w:r>
+        <w:rPr>
+          <w:rFonts w:ascii="Consolas" w:eastAsia="Times New Roman" w:hAnsi="Consolas" w:cs="Times New Roman"/>
+          <w:color w:val="D4D4D4"/>
+          <w:kern w:val="0"/>
+          <w:sz w:val="21"/>
+          <w:szCs w:val="21"/>
+          <w:lang w:eastAsia="pt-BR"/>
+          <w14:ligatures w14:val="none"/>
+        </w:rPr>
+        <w:t>(</w:t>
+      </w:r>
+      <w:proofErr w:type="gramEnd"/>
+      <w:r>
+        <w:rPr>
+          <w:rFonts w:ascii="Consolas" w:eastAsia="Times New Roman" w:hAnsi="Consolas" w:cs="Times New Roman"/>
+          <w:color w:val="CE9178"/>
+          <w:kern w:val="0"/>
+          <w:sz w:val="21"/>
+          <w:szCs w:val="21"/>
+          <w:lang w:eastAsia="pt-BR"/>
+          <w14:ligatures w14:val="none"/>
+        </w:rPr>
+        <w:t>"/api/auth/signup"</w:t>
+      </w:r>
+      <w:r>
+        <w:rPr>
+          <w:rFonts w:ascii="Consolas" w:eastAsia="Times New Roman" w:hAnsi="Consolas" w:cs="Times New Roman"/>
+          <w:color w:val="D4D4D4"/>
+          <w:kern w:val="0"/>
+          <w:sz w:val="21"/>
+          <w:szCs w:val="21"/>
+          <w:lang w:eastAsia="pt-BR"/>
+          <w14:ligatures w14:val="none"/>
+        </w:rPr>
+        <w:t>, (</w:t>
+      </w:r>
+      <w:r>
+        <w:rPr>
+          <w:rFonts w:ascii="Consolas" w:eastAsia="Times New Roman" w:hAnsi="Consolas" w:cs="Times New Roman"/>
+          <w:color w:val="9CDCFE"/>
+          <w:kern w:val="0"/>
+          <w:sz w:val="21"/>
+          <w:szCs w:val="21"/>
+          <w:lang w:eastAsia="pt-BR"/>
+          <w14:ligatures w14:val="none"/>
+        </w:rPr>
+        <w:t>req</w:t>
+      </w:r>
+      <w:r>
+        <w:rPr>
+          <w:rFonts w:ascii="Consolas" w:eastAsia="Times New Roman" w:hAnsi="Consolas" w:cs="Times New Roman"/>
+          <w:color w:val="D4D4D4"/>
+          <w:kern w:val="0"/>
+          <w:sz w:val="21"/>
+          <w:szCs w:val="21"/>
+          <w:lang w:eastAsia="pt-BR"/>
+          <w14:ligatures w14:val="none"/>
+        </w:rPr>
+        <w:t xml:space="preserve">, </w:t>
+      </w:r>
+      <w:r>
+        <w:rPr>
+          <w:rFonts w:ascii="Consolas" w:eastAsia="Times New Roman" w:hAnsi="Consolas" w:cs="Times New Roman"/>
+          <w:color w:val="9CDCFE"/>
+          <w:kern w:val="0"/>
+          <w:sz w:val="21"/>
+          <w:szCs w:val="21"/>
+          <w:lang w:eastAsia="pt-BR"/>
+          <w14:ligatures w14:val="none"/>
+        </w:rPr>
+        <w:t>res</w:t>
+      </w:r>
+      <w:r>
+        <w:rPr>
+          <w:rFonts w:ascii="Consolas" w:eastAsia="Times New Roman" w:hAnsi="Consolas" w:cs="Times New Roman"/>
+          <w:color w:val="D4D4D4"/>
+          <w:kern w:val="0"/>
+          <w:sz w:val="21"/>
+          <w:szCs w:val="21"/>
+          <w:lang w:eastAsia="pt-BR"/>
+          <w14:ligatures w14:val="none"/>
+        </w:rPr>
+        <w:t xml:space="preserve">) </w:t>
+      </w:r>
+      <w:r>
+        <w:rPr>
+          <w:rFonts w:ascii="Consolas" w:eastAsia="Times New Roman" w:hAnsi="Consolas" w:cs="Times New Roman"/>
+          <w:color w:val="569CD6"/>
+          <w:kern w:val="0"/>
+          <w:sz w:val="21"/>
+          <w:szCs w:val="21"/>
+          <w:lang w:eastAsia="pt-BR"/>
+          <w14:ligatures w14:val="none"/>
+        </w:rPr>
+        <w:t>=&gt;</w:t>
+      </w:r>
+      <w:r>
+        <w:rPr>
+          <w:rFonts w:ascii="Consolas" w:eastAsia="Times New Roman" w:hAnsi="Consolas" w:cs="Times New Roman"/>
+          <w:color w:val="D4D4D4"/>
+          <w:kern w:val="0"/>
+          <w:sz w:val="21"/>
+          <w:szCs w:val="21"/>
+          <w:lang w:eastAsia="pt-BR"/>
+          <w14:ligatures w14:val="none"/>
+        </w:rPr>
+        <w:t xml:space="preserve"> {</w:t>
+      </w:r>
+    </w:p>
+    <w:p>
+      <w:pPr>
+        <w:shd w:val="clear" w:color="auto" w:fill="1E1E1E"/>
+        <w:spacing w:after="0" w:line="285" w:lineRule="atLeast"/>
+        <w:rPr>
+          <w:rFonts w:ascii="Consolas" w:eastAsia="Times New Roman" w:hAnsi="Consolas" w:cs="Times New Roman"/>
+          <w:color w:val="D4D4D4"/>
+          <w:kern w:val="0"/>
+          <w:sz w:val="21"/>
+          <w:szCs w:val="21"/>
+          <w:lang w:eastAsia="pt-BR"/>
+          <w14:ligatures w14:val="none"/>
+        </w:rPr>
+      </w:pPr>
+      <w:r>
+        <w:rPr>
+          <w:rFonts w:ascii="Consolas" w:eastAsia="Times New Roman" w:hAnsi="Consolas" w:cs="Times New Roman"/>
+          <w:color w:val="D4D4D4"/>
+          <w:kern w:val="0"/>
+          <w:sz w:val="21"/>
+          <w:szCs w:val="21"/>
+          <w:lang w:eastAsia="pt-BR"/>
+          <w14:ligatures w14:val="none"/>
+        </w:rPr>
+        <w:t xml:space="preserve">    </w:t>
+      </w:r>
+      <w:proofErr w:type="gramStart"/>
+      <w:r>
+        <w:rPr>
+          <w:rFonts w:ascii="Consolas" w:eastAsia="Times New Roman" w:hAnsi="Consolas" w:cs="Times New Roman"/>
+          <w:color w:val="9CDCFE"/>
+          <w:kern w:val="0"/>
+          <w:sz w:val="21"/>
+          <w:szCs w:val="21"/>
+          <w:lang w:eastAsia="pt-BR"/>
+          <w14:ligatures w14:val="none"/>
+        </w:rPr>
+        <w:t>req</w:t>
+      </w:r>
+      <w:r>
+        <w:rPr>
+          <w:rFonts w:ascii="Consolas" w:eastAsia="Times New Roman" w:hAnsi="Consolas" w:cs="Times New Roman"/>
+          <w:color w:val="D4D4D4"/>
+          <w:kern w:val="0"/>
+          <w:sz w:val="21"/>
+          <w:szCs w:val="21"/>
+          <w:lang w:eastAsia="pt-BR"/>
+          <w14:ligatures w14:val="none"/>
+        </w:rPr>
+        <w:t>.</w:t>
+      </w:r>
+      <w:r>
+        <w:rPr>
+          <w:rFonts w:ascii="Consolas" w:eastAsia="Times New Roman" w:hAnsi="Consolas" w:cs="Times New Roman"/>
+          <w:color w:val="DCDCAA"/>
+          <w:kern w:val="0"/>
+          <w:sz w:val="21"/>
+          <w:szCs w:val="21"/>
+          <w:lang w:eastAsia="pt-BR"/>
+          <w14:ligatures w14:val="none"/>
+        </w:rPr>
+        <w:t>send</w:t>
+      </w:r>
+      <w:proofErr w:type="gramEnd"/>
+      <w:r>
+        <w:rPr>
+          <w:rFonts w:ascii="Consolas" w:eastAsia="Times New Roman" w:hAnsi="Consolas" w:cs="Times New Roman"/>
+          <w:color w:val="D4D4D4"/>
+          <w:kern w:val="0"/>
+          <w:sz w:val="21"/>
+          <w:szCs w:val="21"/>
+          <w:lang w:eastAsia="pt-BR"/>
+          <w14:ligatures w14:val="none"/>
+        </w:rPr>
+        <w:t>(</w:t>
+      </w:r>
+      <w:r>
+        <w:rPr>
+          <w:rFonts w:ascii="Consolas" w:eastAsia="Times New Roman" w:hAnsi="Consolas" w:cs="Times New Roman"/>
+          <w:color w:val="CE9178"/>
+          <w:kern w:val="0"/>
+          <w:sz w:val="21"/>
+          <w:szCs w:val="21"/>
+          <w:lang w:eastAsia="pt-BR"/>
+          <w14:ligatures w14:val="none"/>
+        </w:rPr>
+        <w:t>'rota de cadastro'</w:t>
+      </w:r>
+      <w:r>
+        <w:rPr>
+          <w:rFonts w:ascii="Consolas" w:eastAsia="Times New Roman" w:hAnsi="Consolas" w:cs="Times New Roman"/>
+          <w:color w:val="D4D4D4"/>
+          <w:kern w:val="0"/>
+          <w:sz w:val="21"/>
+          <w:szCs w:val="21"/>
+          <w:lang w:eastAsia="pt-BR"/>
+          <w14:ligatures w14:val="none"/>
+        </w:rPr>
+        <w:t>)</w:t>
+      </w:r>
+    </w:p>
+    <w:p>
+      <w:pPr>
+        <w:shd w:val="clear" w:color="auto" w:fill="1E1E1E"/>
+        <w:spacing w:after="0" w:line="285" w:lineRule="atLeast"/>
+        <w:rPr>
+          <w:rFonts w:ascii="Consolas" w:eastAsia="Times New Roman" w:hAnsi="Consolas" w:cs="Times New Roman"/>
+          <w:color w:val="D4D4D4"/>
+          <w:kern w:val="0"/>
+          <w:sz w:val="21"/>
+          <w:szCs w:val="21"/>
+          <w:lang w:eastAsia="pt-BR"/>
+          <w14:ligatures w14:val="none"/>
+        </w:rPr>
+      </w:pPr>
+      <w:r>
+        <w:rPr>
+          <w:rFonts w:ascii="Consolas" w:eastAsia="Times New Roman" w:hAnsi="Consolas" w:cs="Times New Roman"/>
+          <w:color w:val="D4D4D4"/>
+          <w:kern w:val="0"/>
+          <w:sz w:val="21"/>
+          <w:szCs w:val="21"/>
+          <w:lang w:eastAsia="pt-BR"/>
+          <w14:ligatures w14:val="none"/>
+        </w:rPr>
+        <w:t>});</w:t>
+      </w:r>
+    </w:p>
+    <w:p>
+      <w:pPr>
+        <w:shd w:val="clear" w:color="auto" w:fill="1E1E1E"/>
+        <w:spacing w:after="0" w:line="285" w:lineRule="atLeast"/>
+        <w:rPr>
+          <w:rFonts w:ascii="Consolas" w:eastAsia="Times New Roman" w:hAnsi="Consolas" w:cs="Times New Roman"/>
+          <w:color w:val="D4D4D4"/>
+          <w:kern w:val="0"/>
+          <w:sz w:val="21"/>
+          <w:szCs w:val="21"/>
+          <w:lang w:eastAsia="pt-BR"/>
+          <w14:ligatures w14:val="none"/>
+        </w:rPr>
+      </w:pPr>
+    </w:p>
+    <w:p>
+      <w:pPr>
+        <w:shd w:val="clear" w:color="auto" w:fill="1E1E1E"/>
+        <w:spacing w:after="0" w:line="285" w:lineRule="atLeast"/>
+        <w:rPr>
+          <w:rFonts w:ascii="Consolas" w:eastAsia="Times New Roman" w:hAnsi="Consolas" w:cs="Times New Roman"/>
+          <w:color w:val="D4D4D4"/>
+          <w:kern w:val="0"/>
+          <w:sz w:val="21"/>
+          <w:szCs w:val="21"/>
+          <w:lang w:eastAsia="pt-BR"/>
+          <w14:ligatures w14:val="none"/>
+        </w:rPr>
+      </w:pPr>
+      <w:proofErr w:type="gramStart"/>
+      <w:r>
+        <w:rPr>
+          <w:rFonts w:ascii="Consolas" w:eastAsia="Times New Roman" w:hAnsi="Consolas" w:cs="Times New Roman"/>
+          <w:color w:val="4FC1FF"/>
+          <w:kern w:val="0"/>
+          <w:sz w:val="21"/>
+          <w:szCs w:val="21"/>
+          <w:lang w:eastAsia="pt-BR"/>
+          <w14:ligatures w14:val="none"/>
+        </w:rPr>
+        <w:t>app</w:t>
+      </w:r>
+      <w:r>
+        <w:rPr>
+          <w:rFonts w:ascii="Consolas" w:eastAsia="Times New Roman" w:hAnsi="Consolas" w:cs="Times New Roman"/>
+          <w:color w:val="D4D4D4"/>
+          <w:kern w:val="0"/>
+          <w:sz w:val="21"/>
+          <w:szCs w:val="21"/>
+          <w:lang w:eastAsia="pt-BR"/>
+          <w14:ligatures w14:val="none"/>
+        </w:rPr>
+        <w:t>.</w:t>
+      </w:r>
+      <w:r>
+        <w:rPr>
+          <w:rFonts w:ascii="Consolas" w:eastAsia="Times New Roman" w:hAnsi="Consolas" w:cs="Times New Roman"/>
+          <w:color w:val="DCDCAA"/>
+          <w:kern w:val="0"/>
+          <w:sz w:val="21"/>
+          <w:szCs w:val="21"/>
+          <w:lang w:eastAsia="pt-BR"/>
+          <w14:ligatures w14:val="none"/>
+        </w:rPr>
+        <w:t>get</w:t>
+      </w:r>
+      <w:r>
+        <w:rPr>
+          <w:rFonts w:ascii="Consolas" w:eastAsia="Times New Roman" w:hAnsi="Consolas" w:cs="Times New Roman"/>
+          <w:color w:val="D4D4D4"/>
+          <w:kern w:val="0"/>
+          <w:sz w:val="21"/>
+          <w:szCs w:val="21"/>
+          <w:lang w:eastAsia="pt-BR"/>
+          <w14:ligatures w14:val="none"/>
+        </w:rPr>
+        <w:t>(</w:t>
+      </w:r>
+      <w:proofErr w:type="gramEnd"/>
+      <w:r>
+        <w:rPr>
+          <w:rFonts w:ascii="Consolas" w:eastAsia="Times New Roman" w:hAnsi="Consolas" w:cs="Times New Roman"/>
+          <w:color w:val="CE9178"/>
+          <w:kern w:val="0"/>
+          <w:sz w:val="21"/>
+          <w:szCs w:val="21"/>
+          <w:lang w:eastAsia="pt-BR"/>
+          <w14:ligatures w14:val="none"/>
+        </w:rPr>
+        <w:t>"/api/auth/login"</w:t>
+      </w:r>
+      <w:r>
+        <w:rPr>
+          <w:rFonts w:ascii="Consolas" w:eastAsia="Times New Roman" w:hAnsi="Consolas" w:cs="Times New Roman"/>
+          <w:color w:val="D4D4D4"/>
+          <w:kern w:val="0"/>
+          <w:sz w:val="21"/>
+          <w:szCs w:val="21"/>
+          <w:lang w:eastAsia="pt-BR"/>
+          <w14:ligatures w14:val="none"/>
+        </w:rPr>
+        <w:t>, (</w:t>
+      </w:r>
+      <w:r>
+        <w:rPr>
+          <w:rFonts w:ascii="Consolas" w:eastAsia="Times New Roman" w:hAnsi="Consolas" w:cs="Times New Roman"/>
+          <w:color w:val="9CDCFE"/>
+          <w:kern w:val="0"/>
+          <w:sz w:val="21"/>
+          <w:szCs w:val="21"/>
+          <w:lang w:eastAsia="pt-BR"/>
+          <w14:ligatures w14:val="none"/>
+        </w:rPr>
+        <w:t>req</w:t>
+      </w:r>
+      <w:r>
+        <w:rPr>
+          <w:rFonts w:ascii="Consolas" w:eastAsia="Times New Roman" w:hAnsi="Consolas" w:cs="Times New Roman"/>
+          <w:color w:val="D4D4D4"/>
+          <w:kern w:val="0"/>
+          <w:sz w:val="21"/>
+          <w:szCs w:val="21"/>
+          <w:lang w:eastAsia="pt-BR"/>
+          <w14:ligatures w14:val="none"/>
+        </w:rPr>
+        <w:t xml:space="preserve">, </w:t>
+      </w:r>
+      <w:r>
+        <w:rPr>
+          <w:rFonts w:ascii="Consolas" w:eastAsia="Times New Roman" w:hAnsi="Consolas" w:cs="Times New Roman"/>
+          <w:color w:val="9CDCFE"/>
+          <w:kern w:val="0"/>
+          <w:sz w:val="21"/>
+          <w:szCs w:val="21"/>
+          <w:lang w:eastAsia="pt-BR"/>
+          <w14:ligatures w14:val="none"/>
+        </w:rPr>
+        <w:t>res</w:t>
+      </w:r>
+      <w:r>
+        <w:rPr>
+          <w:rFonts w:ascii="Consolas" w:eastAsia="Times New Roman" w:hAnsi="Consolas" w:cs="Times New Roman"/>
+          <w:color w:val="D4D4D4"/>
+          <w:kern w:val="0"/>
+          <w:sz w:val="21"/>
+          <w:szCs w:val="21"/>
+          <w:lang w:eastAsia="pt-BR"/>
+          <w14:ligatures w14:val="none"/>
+        </w:rPr>
+        <w:t xml:space="preserve">) </w:t>
+      </w:r>
+      <w:r>
+        <w:rPr>
+          <w:rFonts w:ascii="Consolas" w:eastAsia="Times New Roman" w:hAnsi="Consolas" w:cs="Times New Roman"/>
+          <w:color w:val="569CD6"/>
+          <w:kern w:val="0"/>
+          <w:sz w:val="21"/>
+          <w:szCs w:val="21"/>
+          <w:lang w:eastAsia="pt-BR"/>
+          <w14:ligatures w14:val="none"/>
+        </w:rPr>
+        <w:t>=&gt;</w:t>
+      </w:r>
+      <w:r>
+        <w:rPr>
+          <w:rFonts w:ascii="Consolas" w:eastAsia="Times New Roman" w:hAnsi="Consolas" w:cs="Times New Roman"/>
+          <w:color w:val="D4D4D4"/>
+          <w:kern w:val="0"/>
+          <w:sz w:val="21"/>
+          <w:szCs w:val="21"/>
+          <w:lang w:eastAsia="pt-BR"/>
+          <w14:ligatures w14:val="none"/>
+        </w:rPr>
+        <w:t xml:space="preserve"> {</w:t>
+      </w:r>
+    </w:p>
+    <w:p>
+      <w:pPr>
+        <w:shd w:val="clear" w:color="auto" w:fill="1E1E1E"/>
+        <w:spacing w:after="0" w:line="285" w:lineRule="atLeast"/>
+        <w:rPr>
+          <w:rFonts w:ascii="Consolas" w:eastAsia="Times New Roman" w:hAnsi="Consolas" w:cs="Times New Roman"/>
+          <w:color w:val="D4D4D4"/>
+          <w:kern w:val="0"/>
+          <w:sz w:val="21"/>
+          <w:szCs w:val="21"/>
+          <w:lang w:eastAsia="pt-BR"/>
+          <w14:ligatures w14:val="none"/>
+        </w:rPr>
+      </w:pPr>
+      <w:r>
+        <w:rPr>
+          <w:rFonts w:ascii="Consolas" w:eastAsia="Times New Roman" w:hAnsi="Consolas" w:cs="Times New Roman"/>
+          <w:color w:val="D4D4D4"/>
+          <w:kern w:val="0"/>
+          <w:sz w:val="21"/>
+          <w:szCs w:val="21"/>
+          <w:lang w:eastAsia="pt-BR"/>
+          <w14:ligatures w14:val="none"/>
+        </w:rPr>
+        <w:t xml:space="preserve">    </w:t>
+      </w:r>
+      <w:proofErr w:type="gramStart"/>
+      <w:r>
+        <w:rPr>
+          <w:rFonts w:ascii="Consolas" w:eastAsia="Times New Roman" w:hAnsi="Consolas" w:cs="Times New Roman"/>
+          <w:color w:val="9CDCFE"/>
+          <w:kern w:val="0"/>
+          <w:sz w:val="21"/>
+          <w:szCs w:val="21"/>
+          <w:lang w:eastAsia="pt-BR"/>
+          <w14:ligatures w14:val="none"/>
+        </w:rPr>
+        <w:t>req</w:t>
+      </w:r>
+      <w:r>
+        <w:rPr>
+          <w:rFonts w:ascii="Consolas" w:eastAsia="Times New Roman" w:hAnsi="Consolas" w:cs="Times New Roman"/>
+          <w:color w:val="D4D4D4"/>
+          <w:kern w:val="0"/>
+          <w:sz w:val="21"/>
+          <w:szCs w:val="21"/>
+          <w:lang w:eastAsia="pt-BR"/>
+          <w14:ligatures w14:val="none"/>
+        </w:rPr>
+        <w:t>.</w:t>
+      </w:r>
+      <w:r>
+        <w:rPr>
+          <w:rFonts w:ascii="Consolas" w:eastAsia="Times New Roman" w:hAnsi="Consolas" w:cs="Times New Roman"/>
+          <w:color w:val="DCDCAA"/>
+          <w:kern w:val="0"/>
+          <w:sz w:val="21"/>
+          <w:szCs w:val="21"/>
+          <w:lang w:eastAsia="pt-BR"/>
+          <w14:ligatures w14:val="none"/>
+        </w:rPr>
+        <w:t>send</w:t>
+      </w:r>
+      <w:proofErr w:type="gramEnd"/>
+      <w:r>
+        <w:rPr>
+          <w:rFonts w:ascii="Consolas" w:eastAsia="Times New Roman" w:hAnsi="Consolas" w:cs="Times New Roman"/>
+          <w:color w:val="D4D4D4"/>
+          <w:kern w:val="0"/>
+          <w:sz w:val="21"/>
+          <w:szCs w:val="21"/>
+          <w:lang w:eastAsia="pt-BR"/>
+          <w14:ligatures w14:val="none"/>
+        </w:rPr>
+        <w:t>(</w:t>
+      </w:r>
+      <w:r>
+        <w:rPr>
+          <w:rFonts w:ascii="Consolas" w:eastAsia="Times New Roman" w:hAnsi="Consolas" w:cs="Times New Roman"/>
+          <w:color w:val="CE9178"/>
+          <w:kern w:val="0"/>
+          <w:sz w:val="21"/>
+          <w:szCs w:val="21"/>
+          <w:lang w:eastAsia="pt-BR"/>
+          <w14:ligatures w14:val="none"/>
+        </w:rPr>
+        <w:t>'rota de login'</w:t>
+      </w:r>
+      <w:r>
+        <w:rPr>
+          <w:rFonts w:ascii="Consolas" w:eastAsia="Times New Roman" w:hAnsi="Consolas" w:cs="Times New Roman"/>
+          <w:color w:val="D4D4D4"/>
+          <w:kern w:val="0"/>
+          <w:sz w:val="21"/>
+          <w:szCs w:val="21"/>
+          <w:lang w:eastAsia="pt-BR"/>
+          <w14:ligatures w14:val="none"/>
+        </w:rPr>
+        <w:t>)</w:t>
+      </w:r>
+    </w:p>
+    <w:p>
+      <w:pPr>
+        <w:shd w:val="clear" w:color="auto" w:fill="1E1E1E"/>
+        <w:spacing w:after="0" w:line="285" w:lineRule="atLeast"/>
+        <w:rPr>
+          <w:rFonts w:ascii="Consolas" w:eastAsia="Times New Roman" w:hAnsi="Consolas" w:cs="Times New Roman"/>
+          <w:color w:val="D4D4D4"/>
+          <w:kern w:val="0"/>
+          <w:sz w:val="21"/>
+          <w:szCs w:val="21"/>
+          <w:lang w:eastAsia="pt-BR"/>
+          <w14:ligatures w14:val="none"/>
+        </w:rPr>
+      </w:pPr>
+      <w:r>
+        <w:rPr>
+          <w:rFonts w:ascii="Consolas" w:eastAsia="Times New Roman" w:hAnsi="Consolas" w:cs="Times New Roman"/>
+          <w:color w:val="D4D4D4"/>
+          <w:kern w:val="0"/>
+          <w:sz w:val="21"/>
+          <w:szCs w:val="21"/>
+          <w:lang w:eastAsia="pt-BR"/>
+          <w14:ligatures w14:val="none"/>
+        </w:rPr>
+        <w:t>});</w:t>
+      </w:r>
+    </w:p>
+    <w:p>
+      <w:pPr>
+        <w:shd w:val="clear" w:color="auto" w:fill="1E1E1E"/>
+        <w:spacing w:after="0" w:line="285" w:lineRule="atLeast"/>
+        <w:rPr>
+          <w:rFonts w:ascii="Consolas" w:eastAsia="Times New Roman" w:hAnsi="Consolas" w:cs="Times New Roman"/>
+          <w:color w:val="D4D4D4"/>
+          <w:kern w:val="0"/>
+          <w:sz w:val="21"/>
+          <w:szCs w:val="21"/>
+          <w:lang w:eastAsia="pt-BR"/>
+          <w14:ligatures w14:val="none"/>
+        </w:rPr>
+      </w:pPr>
+    </w:p>
+    <w:p>
+      <w:pPr>
+        <w:shd w:val="clear" w:color="auto" w:fill="1E1E1E"/>
+        <w:spacing w:after="0" w:line="285" w:lineRule="atLeast"/>
+        <w:rPr>
+          <w:rFonts w:ascii="Consolas" w:eastAsia="Times New Roman" w:hAnsi="Consolas" w:cs="Times New Roman"/>
+          <w:color w:val="D4D4D4"/>
+          <w:kern w:val="0"/>
+          <w:sz w:val="21"/>
+          <w:szCs w:val="21"/>
+          <w:lang w:eastAsia="pt-BR"/>
+          <w14:ligatures w14:val="none"/>
+        </w:rPr>
+      </w:pPr>
+      <w:proofErr w:type="gramStart"/>
+      <w:r>
+        <w:rPr>
+          <w:rFonts w:ascii="Consolas" w:eastAsia="Times New Roman" w:hAnsi="Consolas" w:cs="Times New Roman"/>
+          <w:color w:val="4FC1FF"/>
+          <w:kern w:val="0"/>
+          <w:sz w:val="21"/>
+          <w:szCs w:val="21"/>
+          <w:lang w:eastAsia="pt-BR"/>
+          <w14:ligatures w14:val="none"/>
+        </w:rPr>
+        <w:t>app</w:t>
+      </w:r>
+      <w:r>
+        <w:rPr>
+          <w:rFonts w:ascii="Consolas" w:eastAsia="Times New Roman" w:hAnsi="Consolas" w:cs="Times New Roman"/>
+          <w:color w:val="D4D4D4"/>
+          <w:kern w:val="0"/>
+          <w:sz w:val="21"/>
+          <w:szCs w:val="21"/>
+          <w:lang w:eastAsia="pt-BR"/>
+          <w14:ligatures w14:val="none"/>
+        </w:rPr>
+        <w:t>.</w:t>
+      </w:r>
+      <w:r>
+        <w:rPr>
+          <w:rFonts w:ascii="Consolas" w:eastAsia="Times New Roman" w:hAnsi="Consolas" w:cs="Times New Roman"/>
+          <w:color w:val="DCDCAA"/>
+          <w:kern w:val="0"/>
+          <w:sz w:val="21"/>
+          <w:szCs w:val="21"/>
+          <w:lang w:eastAsia="pt-BR"/>
+          <w14:ligatures w14:val="none"/>
+        </w:rPr>
+        <w:t>get</w:t>
+      </w:r>
+      <w:r>
+        <w:rPr>
+          <w:rFonts w:ascii="Consolas" w:eastAsia="Times New Roman" w:hAnsi="Consolas" w:cs="Times New Roman"/>
+          <w:color w:val="D4D4D4"/>
+          <w:kern w:val="0"/>
+          <w:sz w:val="21"/>
+          <w:szCs w:val="21"/>
+          <w:lang w:eastAsia="pt-BR"/>
+          <w14:ligatures w14:val="none"/>
+        </w:rPr>
+        <w:t>(</w:t>
+      </w:r>
+      <w:proofErr w:type="gramEnd"/>
+      <w:r>
+        <w:rPr>
+          <w:rFonts w:ascii="Consolas" w:eastAsia="Times New Roman" w:hAnsi="Consolas" w:cs="Times New Roman"/>
+          <w:color w:val="CE9178"/>
+          <w:kern w:val="0"/>
+          <w:sz w:val="21"/>
+          <w:szCs w:val="21"/>
+          <w:lang w:eastAsia="pt-BR"/>
+          <w14:ligatures w14:val="none"/>
+        </w:rPr>
+        <w:t>"/api/auth/logout"</w:t>
+      </w:r>
+      <w:r>
+        <w:rPr>
+          <w:rFonts w:ascii="Consolas" w:eastAsia="Times New Roman" w:hAnsi="Consolas" w:cs="Times New Roman"/>
+          <w:color w:val="D4D4D4"/>
+          <w:kern w:val="0"/>
+          <w:sz w:val="21"/>
+          <w:szCs w:val="21"/>
+          <w:lang w:eastAsia="pt-BR"/>
+          <w14:ligatures w14:val="none"/>
+        </w:rPr>
+        <w:t>, (</w:t>
+      </w:r>
+      <w:r>
+        <w:rPr>
+          <w:rFonts w:ascii="Consolas" w:eastAsia="Times New Roman" w:hAnsi="Consolas" w:cs="Times New Roman"/>
+          <w:color w:val="9CDCFE"/>
+          <w:kern w:val="0"/>
+          <w:sz w:val="21"/>
+          <w:szCs w:val="21"/>
+          <w:lang w:eastAsia="pt-BR"/>
+          <w14:ligatures w14:val="none"/>
+        </w:rPr>
+        <w:t>req</w:t>
+      </w:r>
+      <w:r>
+        <w:rPr>
+          <w:rFonts w:ascii="Consolas" w:eastAsia="Times New Roman" w:hAnsi="Consolas" w:cs="Times New Roman"/>
+          <w:color w:val="D4D4D4"/>
+          <w:kern w:val="0"/>
+          <w:sz w:val="21"/>
+          <w:szCs w:val="21"/>
+          <w:lang w:eastAsia="pt-BR"/>
+          <w14:ligatures w14:val="none"/>
+        </w:rPr>
+        <w:t xml:space="preserve">, </w:t>
+      </w:r>
+      <w:r>
+        <w:rPr>
+          <w:rFonts w:ascii="Consolas" w:eastAsia="Times New Roman" w:hAnsi="Consolas" w:cs="Times New Roman"/>
+          <w:color w:val="9CDCFE"/>
+          <w:kern w:val="0"/>
+          <w:sz w:val="21"/>
+          <w:szCs w:val="21"/>
+          <w:lang w:eastAsia="pt-BR"/>
+          <w14:ligatures w14:val="none"/>
+        </w:rPr>
+        <w:t>res</w:t>
+      </w:r>
+      <w:r>
+        <w:rPr>
+          <w:rFonts w:ascii="Consolas" w:eastAsia="Times New Roman" w:hAnsi="Consolas" w:cs="Times New Roman"/>
+          <w:color w:val="D4D4D4"/>
+          <w:kern w:val="0"/>
+          <w:sz w:val="21"/>
+          <w:szCs w:val="21"/>
+          <w:lang w:eastAsia="pt-BR"/>
+          <w14:ligatures w14:val="none"/>
+        </w:rPr>
+        <w:t xml:space="preserve">) </w:t>
+      </w:r>
+      <w:r>
+        <w:rPr>
+          <w:rFonts w:ascii="Consolas" w:eastAsia="Times New Roman" w:hAnsi="Consolas" w:cs="Times New Roman"/>
+          <w:color w:val="569CD6"/>
+          <w:kern w:val="0"/>
+          <w:sz w:val="21"/>
+          <w:szCs w:val="21"/>
+          <w:lang w:eastAsia="pt-BR"/>
+          <w14:ligatures w14:val="none"/>
+        </w:rPr>
+        <w:t>=&gt;</w:t>
+      </w:r>
+      <w:r>
+        <w:rPr>
+          <w:rFonts w:ascii="Consolas" w:eastAsia="Times New Roman" w:hAnsi="Consolas" w:cs="Times New Roman"/>
+          <w:color w:val="D4D4D4"/>
+          <w:kern w:val="0"/>
+          <w:sz w:val="21"/>
+          <w:szCs w:val="21"/>
+          <w:lang w:eastAsia="pt-BR"/>
+          <w14:ligatures w14:val="none"/>
+        </w:rPr>
+        <w:t xml:space="preserve"> {</w:t>
+      </w:r>
+    </w:p>
+    <w:p>
+      <w:pPr>
+        <w:shd w:val="clear" w:color="auto" w:fill="1E1E1E"/>
+        <w:spacing w:after="0" w:line="285" w:lineRule="atLeast"/>
+        <w:rPr>
+          <w:rFonts w:ascii="Consolas" w:eastAsia="Times New Roman" w:hAnsi="Consolas" w:cs="Times New Roman"/>
+          <w:color w:val="D4D4D4"/>
+          <w:kern w:val="0"/>
+          <w:sz w:val="21"/>
+          <w:szCs w:val="21"/>
+          <w:lang w:eastAsia="pt-BR"/>
+          <w14:ligatures w14:val="none"/>
+        </w:rPr>
+      </w:pPr>
+      <w:r>
+        <w:rPr>
+          <w:rFonts w:ascii="Consolas" w:eastAsia="Times New Roman" w:hAnsi="Consolas" w:cs="Times New Roman"/>
+          <w:color w:val="D4D4D4"/>
+          <w:kern w:val="0"/>
+          <w:sz w:val="21"/>
+          <w:szCs w:val="21"/>
+          <w:lang w:eastAsia="pt-BR"/>
+          <w14:ligatures w14:val="none"/>
+        </w:rPr>
+        <w:t xml:space="preserve">    </w:t>
+      </w:r>
+      <w:proofErr w:type="gramStart"/>
+      <w:r>
+        <w:rPr>
+          <w:rFonts w:ascii="Consolas" w:eastAsia="Times New Roman" w:hAnsi="Consolas" w:cs="Times New Roman"/>
+          <w:color w:val="9CDCFE"/>
+          <w:kern w:val="0"/>
+          <w:sz w:val="21"/>
+          <w:szCs w:val="21"/>
+          <w:lang w:eastAsia="pt-BR"/>
+          <w14:ligatures w14:val="none"/>
+        </w:rPr>
+        <w:t>req</w:t>
+      </w:r>
+      <w:r>
+        <w:rPr>
+          <w:rFonts w:ascii="Consolas" w:eastAsia="Times New Roman" w:hAnsi="Consolas" w:cs="Times New Roman"/>
+          <w:color w:val="D4D4D4"/>
+          <w:kern w:val="0"/>
+          <w:sz w:val="21"/>
+          <w:szCs w:val="21"/>
+          <w:lang w:eastAsia="pt-BR"/>
+          <w14:ligatures w14:val="none"/>
+        </w:rPr>
+        <w:t>.</w:t>
+      </w:r>
+      <w:r>
+        <w:rPr>
+          <w:rFonts w:ascii="Consolas" w:eastAsia="Times New Roman" w:hAnsi="Consolas" w:cs="Times New Roman"/>
+          <w:color w:val="DCDCAA"/>
+          <w:kern w:val="0"/>
+          <w:sz w:val="21"/>
+          <w:szCs w:val="21"/>
+          <w:lang w:eastAsia="pt-BR"/>
+          <w14:ligatures w14:val="none"/>
+        </w:rPr>
+        <w:t>send</w:t>
+      </w:r>
+      <w:proofErr w:type="gramEnd"/>
+      <w:r>
+        <w:rPr>
+          <w:rFonts w:ascii="Consolas" w:eastAsia="Times New Roman" w:hAnsi="Consolas" w:cs="Times New Roman"/>
+          <w:color w:val="D4D4D4"/>
+          <w:kern w:val="0"/>
+          <w:sz w:val="21"/>
+          <w:szCs w:val="21"/>
+          <w:lang w:eastAsia="pt-BR"/>
+          <w14:ligatures w14:val="none"/>
+        </w:rPr>
+        <w:t>(</w:t>
+      </w:r>
+      <w:r>
+        <w:rPr>
+          <w:rFonts w:ascii="Consolas" w:eastAsia="Times New Roman" w:hAnsi="Consolas" w:cs="Times New Roman"/>
+          <w:color w:val="CE9178"/>
+          <w:kern w:val="0"/>
+          <w:sz w:val="21"/>
+          <w:szCs w:val="21"/>
+          <w:lang w:eastAsia="pt-BR"/>
+          <w14:ligatures w14:val="none"/>
+        </w:rPr>
+        <w:t>'rota de logout'</w:t>
+      </w:r>
+      <w:r>
+        <w:rPr>
+          <w:rFonts w:ascii="Consolas" w:eastAsia="Times New Roman" w:hAnsi="Consolas" w:cs="Times New Roman"/>
+          <w:color w:val="D4D4D4"/>
+          <w:kern w:val="0"/>
+          <w:sz w:val="21"/>
+          <w:szCs w:val="21"/>
+          <w:lang w:eastAsia="pt-BR"/>
+          <w14:ligatures w14:val="none"/>
+        </w:rPr>
+        <w:t>)</w:t>
+      </w:r>
+    </w:p>
+    <w:p>
+      <w:pPr>
+        <w:shd w:val="clear" w:color="auto" w:fill="1E1E1E"/>
+        <w:spacing w:after="0" w:line="285" w:lineRule="atLeast"/>
+        <w:rPr>
+          <w:rFonts w:ascii="Consolas" w:eastAsia="Times New Roman" w:hAnsi="Consolas" w:cs="Times New Roman"/>
+          <w:color w:val="D4D4D4"/>
+          <w:kern w:val="0"/>
+          <w:sz w:val="21"/>
+          <w:szCs w:val="21"/>
+          <w:lang w:eastAsia="pt-BR"/>
+          <w14:ligatures w14:val="none"/>
+        </w:rPr>
+      </w:pPr>
+      <w:r>
+        <w:rPr>
+          <w:rFonts w:ascii="Consolas" w:eastAsia="Times New Roman" w:hAnsi="Consolas" w:cs="Times New Roman"/>
+          <w:color w:val="D4D4D4"/>
+          <w:kern w:val="0"/>
+          <w:sz w:val="21"/>
+          <w:szCs w:val="21"/>
+          <w:lang w:eastAsia="pt-BR"/>
+          <w14:ligatures w14:val="none"/>
+        </w:rPr>
+        <w:t>});</w:t>
+      </w:r>
+    </w:p>
+    <w:p>
+      <w:pPr>
+        <w:shd w:val="clear" w:color="auto" w:fill="1E1E1E"/>
+        <w:spacing w:after="0" w:line="285" w:lineRule="atLeast"/>
+        <w:rPr>
+          <w:rFonts w:ascii="Consolas" w:eastAsia="Times New Roman" w:hAnsi="Consolas" w:cs="Times New Roman"/>
+          <w:color w:val="D4D4D4"/>
+          <w:kern w:val="0"/>
+          <w:sz w:val="21"/>
+          <w:szCs w:val="21"/>
+          <w:lang w:eastAsia="pt-BR"/>
+          <w14:ligatures w14:val="none"/>
+        </w:rPr>
+      </w:pPr>
+    </w:p>
+    <w:p/>
+    <w:p>
+      <w:r>
+        <w:t>Aqui temos a criação das rotas para separar cada página da aplicação:</w:t>
+      </w:r>
+      <w:r>
+        <w:t xml:space="preserve"> </w:t>
+      </w:r>
+      <w:r>
+        <w:t xml:space="preserve">signup, login e logout, porém </w:t>
+      </w:r>
+      <w:proofErr w:type="gramStart"/>
+      <w:r>
+        <w:t>esta</w:t>
+      </w:r>
+      <w:proofErr w:type="gramEnd"/>
+      <w:r>
+        <w:t xml:space="preserve"> tudo no arquivo do server, o que torna mal organizado. Então criei auth.routes.js para gerenciar essa função.</w:t>
+      </w:r>
+    </w:p>
+    <w:p/>
+    <w:p>
+      <w:r>
+        <w:t xml:space="preserve">Por enquanto, o que eu entedi, é que a </w:t>
+      </w:r>
+      <w:proofErr w:type="gramStart"/>
+      <w:r>
+        <w:t>auth.controller</w:t>
+      </w:r>
+      <w:proofErr w:type="gramEnd"/>
+      <w:r>
+        <w:t xml:space="preserve"> é o arquivo responsável pelas requisições http do nosso projeto. Esses arquivos são como se fossem u mediador entre as routes e a logica do negocio.</w:t>
+      </w:r>
+    </w:p>
+    <w:p/>
+    <w:p/>
+    <w:p>
+      <w:r>
+        <w:rPr>
+          <w:noProof/>
+        </w:rPr>
+        <w:drawing>
+          <wp:inline distT="0" distB="0" distL="0" distR="0" wp14:anchorId="2188C6BA" wp14:editId="788F373D">
+            <wp:extent cx="5400040" cy="1494790"/>
+            <wp:effectExtent l="0" t="0" r="0" b="0"/>
+            <wp:docPr id="1141054290" name="Imagem 1"/>
+            <wp:cNvGraphicFramePr>
+              <a:graphicFrameLocks xmlns:a="http://schemas.openxmlformats.org/drawingml/2006/main" noChangeAspect="1"/>
+            </wp:cNvGraphicFramePr>
+            <a:graphic xmlns:a="http://schemas.openxmlformats.org/drawingml/2006/main">
+              <a:graphicData uri="http://schemas.openxmlformats.org/drawingml/2006/picture">
+                <pic:pic xmlns:pic="http://schemas.openxmlformats.org/drawingml/2006/picture">
+                  <pic:nvPicPr>
+                    <pic:cNvPr id="1141054290" name=""/>
+                    <pic:cNvPicPr/>
+                  </pic:nvPicPr>
+                  <pic:blipFill>
+                    <a:blip r:embed="rId5"/>
+                    <a:stretch>
+                      <a:fillRect/>
+                    </a:stretch>
+                  </pic:blipFill>
+                  <pic:spPr>
+                    <a:xfrm>
+                      <a:off x="0" y="0"/>
+                      <a:ext cx="5400040" cy="1494790"/>
+                    </a:xfrm>
+                    <a:prstGeom prst="rect">
+                      <a:avLst/>
+                    </a:prstGeom>
+                  </pic:spPr>
+                </pic:pic>
+              </a:graphicData>
+            </a:graphic>
+          </wp:inline>
+        </w:drawing>
+      </w:r>
+    </w:p>
     <w:sectPr>
       <w:pgSz w:w="11906" w:h="16838"/>
       <w:pgMar w:top="1417" w:right="1701" w:bottom="1417" w:left="1701" w:header="708" w:footer="708" w:gutter="0"/>
@@ -1020,7 +1726,7 @@
 </file>
 
 <file path=word/numbering.xml><?xml version="1.0" encoding="utf-8"?>
-<w:numbering xmlns:wpc="http://schemas.microsoft.com/office/word/2010/wordprocessingCanvas" xmlns:cx="http://schemas.microsoft.com/office/drawing/2014/chartex" xmlns:cx1="http://schemas.microsoft.com/office/drawing/2015/9/8/chartex" xmlns:cx2="http://schemas.microsoft.com/office/drawing/2015/10/21/chartex" xmlns:cx3="http://schemas.microsoft.com/office/drawing/2016/5/9/chartex" xmlns:cx4="http://schemas.microsoft.com/office/drawing/2016/5/10/chartex" xmlns:cx5="http://schemas.microsoft.com/office/drawing/2016/5/11/chartex" xmlns:cx6="http://schemas.microsoft.com/office/drawing/2016/5/12/chartex" xmlns:cx7="http://schemas.microsoft.com/office/drawing/2016/5/13/chartex" xmlns:cx8="http://schemas.microsoft.com/office/drawing/2016/5/14/chartex" xmlns:mc="http://schemas.openxmlformats.org/markup-compatibility/2006" xmlns:aink="http://schemas.microsoft.com/office/drawing/2016/ink" xmlns:am3d="http://schemas.microsoft.com/office/drawing/2017/model3d" xmlns:o="urn:schemas-microsoft-com:office:office" xmlns:oel="http://schemas.microsoft.com/office/2019/extlst" xmlns:r="http://schemas.openxmlformats.org/officeDocument/2006/relationships" xmlns:m="http://schemas.openxmlformats.org/officeDocument/2006/math" xmlns:v="urn:schemas-microsoft-com:vml" xmlns:wp14="http://schemas.microsoft.com/office/word/2010/wordprocessingDrawing" xmlns:wp="http://schemas.openxmlformats.org/drawingml/2006/wordprocessingDrawing" xmlns:w10="urn:schemas-microsoft-com:office:word" xmlns:w="http://schemas.openxmlformats.org/wordprocessingml/2006/main" xmlns:w14="http://schemas.microsoft.com/office/word/2010/wordml" xmlns:w15="http://schemas.microsoft.com/office/word/2012/wordml" xmlns:w16cex="http://schemas.microsoft.com/office/word/2018/wordml/cex" xmlns:w16cid="http://schemas.microsoft.com/office/word/2016/wordml/cid" xmlns:w16="http://schemas.microsoft.com/office/word/2018/wordml" xmlns:w16sdtdh="http://schemas.microsoft.com/office/word/2020/wordml/sdtdatahash" xmlns:w16se="http://schemas.microsoft.com/office/word/2015/wordml/symex" xmlns:wpg="http://schemas.microsoft.com/office/word/2010/wordprocessingGroup" xmlns:wpi="http://schemas.microsoft.com/office/word/2010/wordprocessingInk" xmlns:wne="http://schemas.microsoft.com/office/word/2006/wordml" xmlns:wps="http://schemas.microsoft.com/office/word/2010/wordprocessingShape" mc:Ignorable="w14 w15 w16se w16cid w16 w16cex w16sdtdh wp14">
+<w:numbering xmlns:wpc="http://schemas.microsoft.com/office/word/2010/wordprocessingCanvas" xmlns:cx="http://schemas.microsoft.com/office/drawing/2014/chartex" xmlns:cx1="http://schemas.microsoft.com/office/drawing/2015/9/8/chartex" xmlns:cx2="http://schemas.microsoft.com/office/drawing/2015/10/21/chartex" xmlns:cx3="http://schemas.microsoft.com/office/drawing/2016/5/9/chartex" xmlns:cx4="http://schemas.microsoft.com/office/drawing/2016/5/10/chartex" xmlns:cx5="http://schemas.microsoft.com/office/drawing/2016/5/11/chartex" xmlns:cx6="http://schemas.microsoft.com/office/drawing/2016/5/12/chartex" xmlns:cx7="http://schemas.microsoft.com/office/drawing/2016/5/13/chartex" xmlns:cx8="http://schemas.microsoft.com/office/drawing/2016/5/14/chartex" xmlns:mc="http://schemas.openxmlformats.org/markup-compatibility/2006" xmlns:aink="http://schemas.microsoft.com/office/drawing/2016/ink" xmlns:am3d="http://schemas.microsoft.com/office/drawing/2017/model3d" xmlns:o="urn:schemas-microsoft-com:office:office" xmlns:oel="http://schemas.microsoft.com/office/2019/extlst" xmlns:r="http://schemas.openxmlformats.org/officeDocument/2006/relationships" xmlns:m="http://schemas.openxmlformats.org/officeDocument/2006/math" xmlns:v="urn:schemas-microsoft-com:vml" xmlns:wp14="http://schemas.microsoft.com/office/word/2010/wordprocessingDrawing" xmlns:wp="http://schemas.openxmlformats.org/drawingml/2006/wordprocessingDrawing" xmlns:w10="urn:schemas-microsoft-com:office:word" xmlns:w="http://schemas.openxmlformats.org/wordprocessingml/2006/main" xmlns:w14="http://schemas.microsoft.com/office/word/2010/wordml" xmlns:w15="http://schemas.microsoft.com/office/word/2012/wordml" xmlns:w16cex="http://schemas.microsoft.com/office/word/2018/wordml/cex" xmlns:w16cid="http://schemas.microsoft.com/office/word/2016/wordml/cid" xmlns:w16="http://schemas.microsoft.com/office/word/2018/wordml" xmlns:w16du="http://schemas.microsoft.com/office/word/2023/wordml/word16du" xmlns:w16sdtdh="http://schemas.microsoft.com/office/word/2020/wordml/sdtdatahash" xmlns:w16se="http://schemas.microsoft.com/office/word/2015/wordml/symex" xmlns:wpg="http://schemas.microsoft.com/office/word/2010/wordprocessingGroup" xmlns:wpi="http://schemas.microsoft.com/office/word/2010/wordprocessingInk" xmlns:wne="http://schemas.microsoft.com/office/word/2006/wordml" xmlns:wps="http://schemas.microsoft.com/office/word/2010/wordprocessingShape" mc:Ignorable="w14 w15 w16se w16cid w16 w16cex w16sdtdh w16du wp14">
   <w:abstractNum w:abstractNumId="0" w15:restartNumberingAfterBreak="0">
     <w:nsid w:val="01513DD0"/>
     <w:multiLevelType w:val="multilevel"/>
@@ -4369,7 +5075,7 @@
 </file>
 
 <file path=word/styles.xml><?xml version="1.0" encoding="utf-8"?>
-<w:styles xmlns:mc="http://schemas.openxmlformats.org/markup-compatibility/2006" xmlns:r="http://schemas.openxmlformats.org/officeDocument/2006/relationships" xmlns:w="http://schemas.openxmlformats.org/wordprocessingml/2006/main" xmlns:w14="http://schemas.microsoft.com/office/word/2010/wordml" xmlns:w15="http://schemas.microsoft.com/office/word/2012/wordml" xmlns:w16cex="http://schemas.microsoft.com/office/word/2018/wordml/cex" xmlns:w16cid="http://schemas.microsoft.com/office/word/2016/wordml/cid" xmlns:w16="http://schemas.microsoft.com/office/word/2018/wordml" xmlns:w16sdtdh="http://schemas.microsoft.com/office/word/2020/wordml/sdtdatahash" xmlns:w16se="http://schemas.microsoft.com/office/word/2015/wordml/symex" mc:Ignorable="w14 w15 w16se w16cid w16 w16cex w16sdtdh">
+<w:styles xmlns:mc="http://schemas.openxmlformats.org/markup-compatibility/2006" xmlns:r="http://schemas.openxmlformats.org/officeDocument/2006/relationships" xmlns:w="http://schemas.openxmlformats.org/wordprocessingml/2006/main" xmlns:w14="http://schemas.microsoft.com/office/word/2010/wordml" xmlns:w15="http://schemas.microsoft.com/office/word/2012/wordml" xmlns:w16cex="http://schemas.microsoft.com/office/word/2018/wordml/cex" xmlns:w16cid="http://schemas.microsoft.com/office/word/2016/wordml/cid" xmlns:w16="http://schemas.microsoft.com/office/word/2018/wordml" xmlns:w16du="http://schemas.microsoft.com/office/word/2023/wordml/word16du" xmlns:w16sdtdh="http://schemas.microsoft.com/office/word/2020/wordml/sdtdatahash" xmlns:w16se="http://schemas.microsoft.com/office/word/2015/wordml/symex" mc:Ignorable="w14 w15 w16se w16cid w16 w16cex w16sdtdh w16du">
   <w:docDefaults>
     <w:rPrDefault>
       <w:rPr>
@@ -4769,6 +5475,27 @@
     <w:name w:val="Normal"/>
     <w:qFormat/>
   </w:style>
+  <w:style w:type="paragraph" w:styleId="Ttulo1">
+    <w:name w:val="heading 1"/>
+    <w:basedOn w:val="Normal"/>
+    <w:next w:val="Normal"/>
+    <w:link w:val="Ttulo1Char"/>
+    <w:uiPriority w:val="9"/>
+    <w:qFormat/>
+    <w:rsid w:val="005535E9"/>
+    <w:pPr>
+      <w:keepNext/>
+      <w:keepLines/>
+      <w:spacing w:before="240" w:after="0"/>
+      <w:outlineLvl w:val="0"/>
+    </w:pPr>
+    <w:rPr>
+      <w:rFonts w:asciiTheme="majorHAnsi" w:eastAsiaTheme="majorEastAsia" w:hAnsiTheme="majorHAnsi" w:cstheme="majorBidi"/>
+      <w:color w:val="2F5496" w:themeColor="accent1" w:themeShade="BF"/>
+      <w:sz w:val="32"/>
+      <w:szCs w:val="32"/>
+    </w:rPr>
+  </w:style>
   <w:style w:type="paragraph" w:styleId="Ttulo3">
     <w:name w:val="heading 3"/>
     <w:basedOn w:val="Normal"/>
@@ -4817,7 +5544,6 @@
   <w:style w:type="character" w:default="1" w:styleId="Fontepargpadro">
     <w:name w:val="Default Paragraph Font"/>
     <w:uiPriority w:val="1"/>
-    <w:semiHidden/>
     <w:unhideWhenUsed/>
   </w:style>
   <w:style w:type="table" w:default="1" w:styleId="Tabelanormal">
@@ -4913,6 +5639,19 @@
       <w:color w:val="1F3763" w:themeColor="accent1" w:themeShade="7F"/>
       <w:sz w:val="24"/>
       <w:szCs w:val="24"/>
+    </w:rPr>
+  </w:style>
+  <w:style w:type="character" w:customStyle="1" w:styleId="Ttulo1Char">
+    <w:name w:val="Título 1 Char"/>
+    <w:basedOn w:val="Fontepargpadro"/>
+    <w:link w:val="Ttulo1"/>
+    <w:uiPriority w:val="9"/>
+    <w:rsid w:val="005535E9"/>
+    <w:rPr>
+      <w:rFonts w:asciiTheme="majorHAnsi" w:eastAsiaTheme="majorEastAsia" w:hAnsiTheme="majorHAnsi" w:cstheme="majorBidi"/>
+      <w:color w:val="2F5496" w:themeColor="accent1" w:themeShade="BF"/>
+      <w:sz w:val="32"/>
+      <w:szCs w:val="32"/>
     </w:rPr>
   </w:style>
 </w:styles>

</xml_diff>